<commit_message>
Fase 2: CU-01 v2.2, MER-01 v2.1 y EVI-01 v1.3 actualizados al sistema completo
</commit_message>
<xml_diff>
--- a/Fase 2/Evidencias Proyecto/Evidencias de documentación/3. AnÃ¡lisis y diseÃ±o/SITRAFO_CU-01_Modelo_de_Casos_de_Uso.docx
+++ b/Fase 2/Evidencias Proyecto/Evidencias de documentación/3. AnÃ¡lisis y diseÃ±o/SITRAFO_CU-01_Modelo_de_Casos_de_Uso.docx
@@ -94,7 +94,7 @@
           <w:sz w:val="26"/>
           <w:szCs w:val="26"/>
         </w:rPr>
-        <w:t xml:space="preserve">CU-01  ·  Versión 2.1</w:t>
+        <w:t xml:space="preserve">CU-01  ·  Versión 2.2</w:t>
       </w:r>
     </w:p>
     <w:tbl>
@@ -362,7 +362,7 @@
                 <w:sz w:val="20"/>
                 <w:szCs w:val="20"/>
               </w:rPr>
-              <w:t xml:space="preserve">ERS-01; Épicas e Historias de Usuario; MER-01 v2.0</w:t>
+              <w:t xml:space="preserve">ERS-01; Épicas e Historias de Usuario; MER-01 v2.1</w:t>
             </w:r>
           </w:p>
         </w:tc>
@@ -1005,7 +1005,7 @@
         <w:spacing w:after="60"/>
       </w:pPr>
       <w:r>
-        <w:t xml:space="preserve">Se identifican los casos implementados de forma parcial y las mejoras pendientes (sección 7).</w:t>
+        <w:t xml:space="preserve">Se registran las mejoras pendientes detectadas en la revisión y su corrección (sección 7).</w:t>
       </w:r>
     </w:p>
     <w:p>
@@ -1265,7 +1265,7 @@
                 <w:sz w:val="20"/>
                 <w:szCs w:val="20"/>
               </w:rPr>
-              <w:t xml:space="preserve">MER-01 v2.0</w:t>
+              <w:t xml:space="preserve">MER-01 v2.1</w:t>
             </w:r>
           </w:p>
         </w:tc>
@@ -3747,7 +3747,7 @@
                 <w:sz w:val="18"/>
                 <w:szCs w:val="18"/>
               </w:rPr>
-              <w:t xml:space="preserve">4</w:t>
+              <w:t xml:space="preserve">6</w:t>
             </w:r>
           </w:p>
         </w:tc>
@@ -3776,7 +3776,7 @@
                 <w:sz w:val="18"/>
                 <w:szCs w:val="18"/>
               </w:rPr>
-              <w:t xml:space="preserve">2</w:t>
+              <w:t xml:space="preserve">0</w:t>
             </w:r>
           </w:p>
         </w:tc>
@@ -3955,7 +3955,7 @@
                 <w:sz w:val="18"/>
                 <w:szCs w:val="18"/>
               </w:rPr>
-              <w:t xml:space="preserve">3</w:t>
+              <w:t xml:space="preserve">5</w:t>
             </w:r>
           </w:p>
         </w:tc>
@@ -3984,7 +3984,7 @@
                 <w:sz w:val="18"/>
                 <w:szCs w:val="18"/>
               </w:rPr>
-              <w:t xml:space="preserve">2</w:t>
+              <w:t xml:space="preserve">0</w:t>
             </w:r>
           </w:p>
         </w:tc>
@@ -4579,7 +4579,7 @@
                 <w:sz w:val="18"/>
                 <w:szCs w:val="18"/>
               </w:rPr>
-              <w:t xml:space="preserve">4</w:t>
+              <w:t xml:space="preserve">5</w:t>
             </w:r>
           </w:p>
         </w:tc>
@@ -4608,7 +4608,7 @@
                 <w:sz w:val="18"/>
                 <w:szCs w:val="18"/>
               </w:rPr>
-              <w:t xml:space="preserve">1</w:t>
+              <w:t xml:space="preserve">0</w:t>
             </w:r>
           </w:p>
         </w:tc>
@@ -5174,7 +5174,7 @@
                 <w:sz w:val="18"/>
                 <w:szCs w:val="18"/>
               </w:rPr>
-              <w:t xml:space="preserve">1</w:t>
+              <w:t xml:space="preserve">2</w:t>
             </w:r>
           </w:p>
         </w:tc>
@@ -5203,7 +5203,7 @@
                 <w:sz w:val="18"/>
                 <w:szCs w:val="18"/>
               </w:rPr>
-              <w:t xml:space="preserve">4</w:t>
+              <w:t xml:space="preserve">5</w:t>
             </w:r>
           </w:p>
         </w:tc>
@@ -5232,7 +5232,7 @@
                 <w:sz w:val="18"/>
                 <w:szCs w:val="18"/>
               </w:rPr>
-              <w:t xml:space="preserve">2</w:t>
+              <w:t xml:space="preserve">0</w:t>
             </w:r>
           </w:p>
         </w:tc>
@@ -5590,7 +5590,7 @@
                 <w:sz w:val="18"/>
                 <w:szCs w:val="18"/>
               </w:rPr>
-              <w:t xml:space="preserve">18</w:t>
+              <w:t xml:space="preserve">19</w:t>
             </w:r>
           </w:p>
         </w:tc>
@@ -5619,7 +5619,7 @@
                 <w:sz w:val="18"/>
                 <w:szCs w:val="18"/>
               </w:rPr>
-              <w:t xml:space="preserve">46</w:t>
+              <w:t xml:space="preserve">52</w:t>
             </w:r>
           </w:p>
         </w:tc>
@@ -5648,7 +5648,7 @@
                 <w:sz w:val="18"/>
                 <w:szCs w:val="18"/>
               </w:rPr>
-              <w:t xml:space="preserve">7</w:t>
+              <w:t xml:space="preserve">0</w:t>
             </w:r>
           </w:p>
         </w:tc>
@@ -5694,7 +5694,7 @@
         <w:jc w:val="both"/>
       </w:pPr>
       <w:r>
-        <w:t xml:space="preserve">Ningún caso de uso de la versión 1.0 quedó sin implementar. Los 46 casos con cambios reflejan sobre todo la automatización del flujo y ajustes de redacción a la interfaz real; los parciales se concentran en mantenedores secundarios.</w:t>
+        <w:t xml:space="preserve">Ningún caso de uso de la versión 1.0 quedó sin implementar. Los 52 casos con cambios reflejan sobre todo la automatización del flujo y ajustes de redacción a la interfaz real. No quedan casos implementados de forma parcial: los siete que lo estaban en la versión 2.1 se completaron en la versión 2.2 del sistema.</w:t>
       </w:r>
     </w:p>
     <w:p>
@@ -7926,7 +7926,7 @@
                 <w:sz w:val="18"/>
                 <w:szCs w:val="18"/>
               </w:rPr>
-              <w:t xml:space="preserve">Escritorio: Clientes → Ficha e historial</w:t>
+              <w:t xml:space="preserve">Escritorio: Clientes → Ficha e historial → Contactos</w:t>
             </w:r>
           </w:p>
         </w:tc>
@@ -7955,7 +7955,7 @@
                 <w:sz w:val="18"/>
                 <w:szCs w:val="18"/>
               </w:rPr>
-              <w:t xml:space="preserve">Parcial</w:t>
+              <w:t xml:space="preserve">Con cambios</w:t>
             </w:r>
           </w:p>
         </w:tc>
@@ -8821,7 +8821,7 @@
                 <w:sz w:val="18"/>
                 <w:szCs w:val="18"/>
               </w:rPr>
-              <w:t xml:space="preserve">Web: /perfil/</w:t>
+              <w:t xml:space="preserve">Web: /perfil/ (Editar datos, Cambiar contraseña)</w:t>
             </w:r>
           </w:p>
         </w:tc>
@@ -8850,7 +8850,7 @@
                 <w:sz w:val="18"/>
                 <w:szCs w:val="18"/>
               </w:rPr>
-              <w:t xml:space="preserve">Parcial</w:t>
+              <w:t xml:space="preserve">Con cambios</w:t>
             </w:r>
           </w:p>
         </w:tc>
@@ -8935,7 +8935,7 @@
         <w:spacing w:after="60"/>
       </w:pPr>
       <w:r>
-        <w:t xml:space="preserve">En el escritorio los contactos y las direcciones sólo se agregan; la edición y eliminación están disponibles en la API pero no en pantalla.</w:t>
+        <w:t xml:space="preserve">En el escritorio los contactos y las direcciones se agregan, editan y eliminan. Hay un solo contacto principal por cliente, que es quien recibe los correos; una dirección usada en una solicitud no se elimina.</w:t>
       </w:r>
     </w:p>
     <w:p>
@@ -8948,7 +8948,7 @@
         <w:spacing w:after="60"/>
       </w:pPr>
       <w:r>
-        <w:t xml:space="preserve">En la web el cliente agrega, edita y elimina sus direcciones, pero sus datos de empresa son de solo lectura.</w:t>
+        <w:t xml:space="preserve">En la web el cliente agrega, edita y elimina sus direcciones, edita la razón social, el nombre de fantasía, el giro y el correo de su cuenta, y cambia su contraseña. El RUT y el tipo de persona no se modifican.</w:t>
       </w:r>
     </w:p>
     <w:p>
@@ -9352,7 +9352,7 @@
                 <w:sz w:val="18"/>
                 <w:szCs w:val="18"/>
               </w:rPr>
-              <w:t xml:space="preserve">Escritorio: Catálogo → Nuevo modelo (Nueva familia)</w:t>
+              <w:t xml:space="preserve">Escritorio: Catálogo → Familias</w:t>
             </w:r>
           </w:p>
         </w:tc>
@@ -9381,7 +9381,7 @@
                 <w:sz w:val="18"/>
                 <w:szCs w:val="18"/>
               </w:rPr>
-              <w:t xml:space="preserve">Parcial</w:t>
+              <w:t xml:space="preserve">Con cambios</w:t>
             </w:r>
           </w:p>
         </w:tc>
@@ -9710,7 +9710,7 @@
                 <w:sz w:val="18"/>
                 <w:szCs w:val="18"/>
               </w:rPr>
-              <w:t xml:space="preserve">Escritorio: Catálogo → Editar</w:t>
+              <w:t xml:space="preserve">Escritorio: Catálogo → Editar; Catálogo → Parámetros técnicos</w:t>
             </w:r>
           </w:p>
         </w:tc>
@@ -9739,7 +9739,7 @@
                 <w:sz w:val="18"/>
                 <w:szCs w:val="18"/>
               </w:rPr>
-              <w:t xml:space="preserve">Parcial</w:t>
+              <w:t xml:space="preserve">Con cambios</w:t>
             </w:r>
           </w:p>
         </w:tc>
@@ -10693,7 +10693,7 @@
         <w:spacing w:after="60"/>
       </w:pPr>
       <w:r>
-        <w:t xml:space="preserve">Sólo existen familias de producto; no hay categorías de producto. Las familias se crean desde el diálogo del modelo, pero no se editan ni desactivan en pantalla.</w:t>
+        <w:t xml:space="preserve">Sólo existen familias de producto; no hay categorías de producto (sección 7). Las familias se crean, editan, desactivan y reactivan en Catálogo → Familias; una familia con modelos vigentes no se desactiva.</w:t>
       </w:r>
     </w:p>
     <w:p>
@@ -10706,7 +10706,7 @@
         <w:spacing w:after="60"/>
       </w:pPr>
       <w:r>
-        <w:t xml:space="preserve">En el escritorio se asignan a cada modelo los parámetros técnicos existentes, con valor por defecto y obligatoriedad; crear un parámetro nuevo requiere la API.</w:t>
+        <w:t xml:space="preserve">En Catálogo → Parámetros técnicos el Administrador crea y edita los parámetros: tipo, unidad, obligatoriedad, rango mínimo y máximo, si el valor lo fija el modelo y los valores de las listas. Un parámetro en uso no cambia de tipo ni se elimina, y sus valores se retiran en vez de borrarse.</w:t>
       </w:r>
     </w:p>
     <w:p>
@@ -15090,7 +15090,7 @@
                 <w:sz w:val="18"/>
                 <w:szCs w:val="18"/>
               </w:rPr>
-              <w:t xml:space="preserve">El sistema valida que los campos obligatorios estén completos y que cada valor sea del tipo esperado.</w:t>
+              <w:t xml:space="preserve">El sistema valida que los campos obligatorios estén completos, que cada valor sea del tipo esperado y esté dentro del rango del parámetro, que la potencia coincida con la del modelo de referencia y que las unidades no superen el tope configurado.</w:t>
             </w:r>
           </w:p>
         </w:tc>
@@ -15642,7 +15642,7 @@
                 <w:sz w:val="18"/>
                 <w:szCs w:val="18"/>
               </w:rPr>
-              <w:t xml:space="preserve">Hay campos obligatorios vacíos o con un tipo inválido. El sistema marca cada campo, conserva lo ingresado y no registra la solicitud.</w:t>
+              <w:t xml:space="preserve">Hay campos obligatorios vacíos, con un tipo inválido, fuera de rango (por ejemplo, una tensión de 1.000.000 kV), una potencia distinta de la del modelo elegido o más unidades que el tope (500 por defecto). El sistema marca cada campo con el motivo, conserva lo ingresado y no registra la solicitud.</w:t>
             </w:r>
           </w:p>
         </w:tc>
@@ -15854,7 +15854,7 @@
           <w:sz w:val="19"/>
           <w:szCs w:val="19"/>
         </w:rPr>
-        <w:t xml:space="preserve">No se valida que los valores técnicos estén dentro de un rango (por ejemplo, la tensión): los parámetros no tienen mínimo ni máximo. Es una mejora pendiente (sección 7).</w:t>
+        <w:t xml:space="preserve">Bajo cada campo numérico la web muestra el rango aceptado. La misma validación se aplica a las solicitudes creadas por la API (hallazgos H-01 y H-02 del EVI-01, corregidos).</w:t>
       </w:r>
     </w:p>
     <w:p>
@@ -17672,7 +17672,7 @@
                 <w:sz w:val="18"/>
                 <w:szCs w:val="18"/>
               </w:rPr>
-              <w:t xml:space="preserve">No hay feriados almacenados. El plazo se calcula excluyendo sólo fines de semana (sin advertencia: mejora pendiente).</w:t>
+              <w:t xml:space="preserve">No hay feriados almacenados para todo el período. El plazo se calcula excluyendo sólo fines de semana y el sistema advierte al ejecutivo que verifique la fecha de entrega antes de emitir.</w:t>
             </w:r>
           </w:p>
         </w:tc>
@@ -21842,7 +21842,7 @@
         <w:spacing w:after="60"/>
       </w:pPr>
       <w:r>
-        <w:t xml:space="preserve">En el escritorio las horas se registran siempre con la fecha del día; la anulación de un registro existe en la API, pero no tiene botón en pantalla.</w:t>
+        <w:t xml:space="preserve">El Jefe de producción registra horas de hasta 30 días atrás, nunca anteriores al inicio de la fabricación, y anula un registro erróneo con motivo (Órdenes de trabajo → Anular horas); el registro anulado deja de sumar al costo y queda en la bitácora.</w:t>
       </w:r>
     </w:p>
     <w:p>
@@ -26859,6 +26859,69 @@
                 <w:sz w:val="18"/>
                 <w:szCs w:val="18"/>
               </w:rPr>
+              <w:t xml:space="preserve">A2</w:t>
+            </w:r>
+          </w:p>
+        </w:tc>
+        <w:tc>
+          <w:tcPr>
+            <w:tcW w:type="dxa" w:w="8460"/>
+            <w:tcBorders>
+              <w:top w:val="single" w:color="8496B0" w:sz="4"/>
+              <w:left w:val="single" w:color="8496B0" w:sz="4"/>
+              <w:bottom w:val="single" w:color="8496B0" w:sz="4"/>
+              <w:right w:val="single" w:color="8496B0" w:sz="4"/>
+            </w:tcBorders>
+            <w:tcMar>
+              <w:top w:type="dxa" w:w="50"/>
+              <w:left w:type="dxa" w:w="90"/>
+              <w:bottom w:type="dxa" w:w="50"/>
+              <w:right w:type="dxa" w:w="90"/>
+            </w:tcMar>
+          </w:tcPr>
+          <w:p>
+            <w:r>
+              <w:rPr>
+                <w:rFonts w:ascii="Calibri" w:cs="Calibri" w:eastAsia="Calibri" w:hAnsi="Calibri"/>
+                <w:b w:val="false"/>
+                <w:bCs w:val="false"/>
+                <w:sz w:val="18"/>
+                <w:szCs w:val="18"/>
+              </w:rPr>
+              <w:t xml:space="preserve">El Jefe de producción registra un día anterior: elige la fecha trabajada, hasta 30 días atrás y no antes del inicio de la fabricación.</w:t>
+            </w:r>
+          </w:p>
+        </w:tc>
+      </w:tr>
+      <w:tr>
+        <w:trPr>
+          <w:cantSplit/>
+        </w:trPr>
+        <w:tc>
+          <w:tcPr>
+            <w:tcW w:type="dxa" w:w="900"/>
+            <w:tcBorders>
+              <w:top w:val="single" w:color="8496B0" w:sz="4"/>
+              <w:left w:val="single" w:color="8496B0" w:sz="4"/>
+              <w:bottom w:val="single" w:color="8496B0" w:sz="4"/>
+              <w:right w:val="single" w:color="8496B0" w:sz="4"/>
+            </w:tcBorders>
+            <w:tcMar>
+              <w:top w:type="dxa" w:w="50"/>
+              <w:left w:type="dxa" w:w="90"/>
+              <w:bottom w:type="dxa" w:w="50"/>
+              <w:right w:type="dxa" w:w="90"/>
+            </w:tcMar>
+          </w:tcPr>
+          <w:p>
+            <w:r>
+              <w:rPr>
+                <w:rFonts w:ascii="Calibri" w:cs="Calibri" w:eastAsia="Calibri" w:hAnsi="Calibri"/>
+                <w:b w:val="false"/>
+                <w:bCs w:val="false"/>
+                <w:sz w:val="18"/>
+                <w:szCs w:val="18"/>
+              </w:rPr>
               <w:t xml:space="preserve">A6</w:t>
             </w:r>
           </w:p>
@@ -26888,7 +26951,7 @@
                 <w:sz w:val="18"/>
                 <w:szCs w:val="18"/>
               </w:rPr>
-              <w:t xml:space="preserve">Corrección de un registro. La API permite anularlo con motivo (permiso taller.anular), pero el escritorio todavía no ofrece el botón (sección 7).</w:t>
+              <w:t xml:space="preserve">Corrección de un registro. El Jefe de producción usa «Anular horas», elige el registro e indica el motivo; el registro queda anulado (no se borra), deja de sumar al costo real y queda en la bitácora (permiso taller.anular).</w:t>
             </w:r>
           </w:p>
         </w:tc>
@@ -27164,7 +27227,7 @@
                 <w:sz w:val="18"/>
                 <w:szCs w:val="18"/>
               </w:rPr>
-              <w:t xml:space="preserve">La fecha es futura (sólo posible por la API). El sistema rechaza el registro.</w:t>
+              <w:t xml:space="preserve">La fecha es futura o anterior al inicio de la fabricación. El sistema rechaza el registro.</w:t>
             </w:r>
           </w:p>
         </w:tc>
@@ -29589,7 +29652,7 @@
                 <w:sz w:val="18"/>
                 <w:szCs w:val="18"/>
               </w:rPr>
-              <w:t xml:space="preserve">Parcial</w:t>
+              <w:t xml:space="preserve">Con cambios</w:t>
             </w:r>
           </w:p>
         </w:tc>
@@ -30761,7 +30824,7 @@
         <w:spacing w:after="60"/>
       </w:pPr>
       <w:r>
-        <w:t xml:space="preserve">Las bodegas sólo se crean y listan; no se editan ni desactivan en pantalla.</w:t>
+        <w:t xml:space="preserve">Las bodegas se crean, editan, desactivan y reactivan; una bodega con stock no se desactiva y su código no cambia.</w:t>
       </w:r>
     </w:p>
     <w:p>
@@ -37185,7 +37248,7 @@
         <w:spacing w:after="60"/>
       </w:pPr>
       <w:r>
-        <w:t xml:space="preserve">Si PayPal no confirma o el monto no coincide, la transacción queda pendiente de conciliación y se revisa después con el comando conciliar_pagos.</w:t>
+        <w:t xml:space="preserve">Si PayPal no confirma o el monto no coincide, la transacción queda pendiente de conciliación; la tarea diaria la revisa en PayPal y, si se confirma, marca el documento como pagado y envía el comprobante.</w:t>
       </w:r>
     </w:p>
     <w:p>
@@ -40204,7 +40267,7 @@
                 <w:sz w:val="18"/>
                 <w:szCs w:val="18"/>
               </w:rPr>
-              <w:t xml:space="preserve">Sin pantalla propia (el formulario se arma con los parámetros técnicos)</w:t>
+              <w:t xml:space="preserve">Escritorio: Catálogo → Parámetros técnicos</w:t>
             </w:r>
           </w:p>
         </w:tc>
@@ -40233,7 +40296,7 @@
                 <w:sz w:val="18"/>
                 <w:szCs w:val="18"/>
               </w:rPr>
-              <w:t xml:space="preserve">Parcial</w:t>
+              <w:t xml:space="preserve">Con cambios</w:t>
             </w:r>
           </w:p>
         </w:tc>
@@ -40770,7 +40833,7 @@
                 <w:sz w:val="18"/>
                 <w:szCs w:val="18"/>
               </w:rPr>
-              <w:t xml:space="preserve">Parcial</w:t>
+              <w:t xml:space="preserve">Implementado</w:t>
             </w:r>
           </w:p>
         </w:tc>
@@ -41047,7 +41110,7 @@
         <w:spacing w:after="60"/>
       </w:pPr>
       <w:r>
-        <w:t xml:space="preserve">No hay pantalla para configurar el formulario de solicitud: muestra todos los parámetros técnicos registrados.</w:t>
+        <w:t xml:space="preserve">El formulario de solicitud se configura en Catálogo → Parámetros técnicos: cada parámetro es un campo, con su obligatoriedad, rango y valores; la web los valida al enviar (CU-ADM-04).</w:t>
       </w:r>
     </w:p>
     <w:p>
@@ -41060,7 +41123,20 @@
         <w:spacing w:after="60"/>
       </w:pPr>
       <w:r>
-        <w:t xml:space="preserve">La creación y el retiro de avisos del sitio todavía no quedan en la bitácora.</w:t>
+        <w:t xml:space="preserve">Los parámetros de negocio (anticipo, umbrales de descuento y de desviación, tope de unidades, vigencia y horas diarias) se editan en Canal web → Cambiar valor, validados por rango; rigen desde la siguiente operación.</w:t>
+      </w:r>
+    </w:p>
+    <w:p>
+      <w:pPr>
+        <w:pStyle w:val="ListParagraph"/>
+        <w:numPr>
+          <w:ilvl w:val="0"/>
+          <w:numId w:val="2"/>
+        </w:numPr>
+        <w:spacing w:after="60"/>
+      </w:pPr>
+      <w:r>
+        <w:t xml:space="preserve">Todo cambio de configuración queda en la bitácora: parámetros, interruptores del canal, avisos del sitio, familias, parámetros técnicos y bodegas.</w:t>
       </w:r>
     </w:p>
     <w:p>
@@ -42577,7 +42653,7 @@
         <w:jc w:val="both"/>
       </w:pPr>
       <w:r>
-        <w:t xml:space="preserve">Este paquete es nuevo: los reportes estaban en la ERS-01 (RF-REP) pero no tenían casos de uso. La tarea diaria sincroniza la UF, la UTM y el dólar, actualiza los feriados del año y del siguiente, y vence las cotizaciones emitidas cuya vigencia terminó. La bandeja de pendientes y los avisos por correo coordinan el traspaso del trabajo entre roles: la bandeja muestra lo que cada rol debe atender ahora y el correo avisa en el momento en que le llega trabajo nuevo.</w:t>
+        <w:t xml:space="preserve">Este paquete es nuevo: los reportes estaban en la ERS-01 (RF-REP) pero no tenían casos de uso. La tarea diaria sincroniza la UF, la UTM y el dólar, actualiza los feriados del año y del siguiente, vence las cotizaciones emitidas cuya vigencia terminó y concilia los pagos pendientes con PayPal. La bandeja de pendientes y los avisos por correo coordinan el traspaso del trabajo entre roles: la bandeja muestra lo que cada rol debe atender ahora y el correo avisa en el momento en que le llega trabajo nuevo.</w:t>
       </w:r>
     </w:p>
     <w:tbl>
@@ -45469,7 +45545,7 @@
         <w:jc w:val="both"/>
       </w:pPr>
       <w:r>
-        <w:t xml:space="preserve">La revisión del código identificó los siguientes puntos, que quedan registrados para los próximos sprints:</w:t>
+        <w:t xml:space="preserve">La revisión del código de la versión 2.0 identificó once puntos pendientes. Los nueve que afectaban a casos de uso se corrigieron entre las versiones 2.1 y 2.2 del sistema: edición y eliminación de contactos y direcciones, perfil del cliente, familias y parámetros técnicos con sus rangos, bodegas, anulación de horas, advertencia de plazo sin feriados, bitácora de avisos, conciliación automática de pagos y parámetros de negocio editables. Quedan registrados:</w:t>
       </w:r>
     </w:p>
     <w:tbl>
@@ -45518,7 +45594,7 @@
                 <w:sz w:val="18"/>
                 <w:szCs w:val="18"/>
               </w:rPr>
-              <w:t xml:space="preserve">Caso de uso</w:t>
+              <w:t xml:space="preserve">Requerimiento</w:t>
             </w:r>
           </w:p>
         </w:tc>
@@ -45582,7 +45658,7 @@
                 <w:sz w:val="18"/>
                 <w:szCs w:val="18"/>
               </w:rPr>
-              <w:t xml:space="preserve">CU-CLI-02, CU-CLI-03</w:t>
+              <w:t xml:space="preserve">RF-CAT-01</w:t>
             </w:r>
           </w:p>
         </w:tc>
@@ -45611,574 +45687,7 @@
                 <w:sz w:val="18"/>
                 <w:szCs w:val="18"/>
               </w:rPr>
-              <w:t xml:space="preserve">En el escritorio los contactos y direcciones sólo se agregan; falta editar y eliminar en pantalla (la API ya lo permite).</w:t>
-            </w:r>
-          </w:p>
-        </w:tc>
-      </w:tr>
-      <w:tr>
-        <w:trPr>
-          <w:cantSplit/>
-        </w:trPr>
-        <w:tc>
-          <w:tcPr>
-            <w:tcW w:type="dxa" w:w="2600"/>
-            <w:tcBorders>
-              <w:top w:val="single" w:color="8496B0" w:sz="4"/>
-              <w:left w:val="single" w:color="8496B0" w:sz="4"/>
-              <w:bottom w:val="single" w:color="8496B0" w:sz="4"/>
-              <w:right w:val="single" w:color="8496B0" w:sz="4"/>
-            </w:tcBorders>
-            <w:tcMar>
-              <w:top w:type="dxa" w:w="50"/>
-              <w:left w:type="dxa" w:w="90"/>
-              <w:bottom w:type="dxa" w:w="50"/>
-              <w:right w:type="dxa" w:w="90"/>
-            </w:tcMar>
-          </w:tcPr>
-          <w:p>
-            <w:r>
-              <w:rPr>
-                <w:rFonts w:ascii="Calibri" w:cs="Calibri" w:eastAsia="Calibri" w:hAnsi="Calibri"/>
-                <w:b w:val="false"/>
-                <w:bCs w:val="false"/>
-                <w:sz w:val="18"/>
-                <w:szCs w:val="18"/>
-              </w:rPr>
-              <w:t xml:space="preserve">CU-CLI-07</w:t>
-            </w:r>
-          </w:p>
-        </w:tc>
-        <w:tc>
-          <w:tcPr>
-            <w:tcW w:type="dxa" w:w="6760"/>
-            <w:tcBorders>
-              <w:top w:val="single" w:color="8496B0" w:sz="4"/>
-              <w:left w:val="single" w:color="8496B0" w:sz="4"/>
-              <w:bottom w:val="single" w:color="8496B0" w:sz="4"/>
-              <w:right w:val="single" w:color="8496B0" w:sz="4"/>
-            </w:tcBorders>
-            <w:tcMar>
-              <w:top w:type="dxa" w:w="50"/>
-              <w:left w:type="dxa" w:w="90"/>
-              <w:bottom w:type="dxa" w:w="50"/>
-              <w:right w:type="dxa" w:w="90"/>
-            </w:tcMar>
-          </w:tcPr>
-          <w:p>
-            <w:r>
-              <w:rPr>
-                <w:rFonts w:ascii="Calibri" w:cs="Calibri" w:eastAsia="Calibri" w:hAnsi="Calibri"/>
-                <w:b w:val="false"/>
-                <w:bCs w:val="false"/>
-                <w:sz w:val="18"/>
-                <w:szCs w:val="18"/>
-              </w:rPr>
-              <w:t xml:space="preserve">El cliente no puede editar los datos de su empresa ni cambiar su contraseña desde el perfil.</w:t>
-            </w:r>
-          </w:p>
-        </w:tc>
-      </w:tr>
-      <w:tr>
-        <w:trPr>
-          <w:cantSplit/>
-        </w:trPr>
-        <w:tc>
-          <w:tcPr>
-            <w:tcW w:type="dxa" w:w="2600"/>
-            <w:tcBorders>
-              <w:top w:val="single" w:color="8496B0" w:sz="4"/>
-              <w:left w:val="single" w:color="8496B0" w:sz="4"/>
-              <w:bottom w:val="single" w:color="8496B0" w:sz="4"/>
-              <w:right w:val="single" w:color="8496B0" w:sz="4"/>
-            </w:tcBorders>
-            <w:tcMar>
-              <w:top w:type="dxa" w:w="50"/>
-              <w:left w:type="dxa" w:w="90"/>
-              <w:bottom w:type="dxa" w:w="50"/>
-              <w:right w:type="dxa" w:w="90"/>
-            </w:tcMar>
-          </w:tcPr>
-          <w:p>
-            <w:r>
-              <w:rPr>
-                <w:rFonts w:ascii="Calibri" w:cs="Calibri" w:eastAsia="Calibri" w:hAnsi="Calibri"/>
-                <w:b w:val="false"/>
-                <w:bCs w:val="false"/>
-                <w:sz w:val="18"/>
-                <w:szCs w:val="18"/>
-              </w:rPr>
-              <w:t xml:space="preserve">CU-CAT-01, CU-CAT-03, CU-ADM-04</w:t>
-            </w:r>
-          </w:p>
-        </w:tc>
-        <w:tc>
-          <w:tcPr>
-            <w:tcW w:type="dxa" w:w="6760"/>
-            <w:tcBorders>
-              <w:top w:val="single" w:color="8496B0" w:sz="4"/>
-              <w:left w:val="single" w:color="8496B0" w:sz="4"/>
-              <w:bottom w:val="single" w:color="8496B0" w:sz="4"/>
-              <w:right w:val="single" w:color="8496B0" w:sz="4"/>
-            </w:tcBorders>
-            <w:tcMar>
-              <w:top w:type="dxa" w:w="50"/>
-              <w:left w:type="dxa" w:w="90"/>
-              <w:bottom w:type="dxa" w:w="50"/>
-              <w:right w:type="dxa" w:w="90"/>
-            </w:tcMar>
-          </w:tcPr>
-          <w:p>
-            <w:r>
-              <w:rPr>
-                <w:rFonts w:ascii="Calibri" w:cs="Calibri" w:eastAsia="Calibri" w:hAnsi="Calibri"/>
-                <w:b w:val="false"/>
-                <w:bCs w:val="false"/>
-                <w:sz w:val="18"/>
-                <w:szCs w:val="18"/>
-              </w:rPr>
-              <w:t xml:space="preserve">No hay categorías de producto ni pantalla para crear parámetros técnicos, sus rangos y los campos del formulario de solicitud.</w:t>
-            </w:r>
-          </w:p>
-        </w:tc>
-      </w:tr>
-      <w:tr>
-        <w:trPr>
-          <w:cantSplit/>
-        </w:trPr>
-        <w:tc>
-          <w:tcPr>
-            <w:tcW w:type="dxa" w:w="2600"/>
-            <w:tcBorders>
-              <w:top w:val="single" w:color="8496B0" w:sz="4"/>
-              <w:left w:val="single" w:color="8496B0" w:sz="4"/>
-              <w:bottom w:val="single" w:color="8496B0" w:sz="4"/>
-              <w:right w:val="single" w:color="8496B0" w:sz="4"/>
-            </w:tcBorders>
-            <w:tcMar>
-              <w:top w:type="dxa" w:w="50"/>
-              <w:left w:type="dxa" w:w="90"/>
-              <w:bottom w:type="dxa" w:w="50"/>
-              <w:right w:type="dxa" w:w="90"/>
-            </w:tcMar>
-          </w:tcPr>
-          <w:p>
-            <w:r>
-              <w:rPr>
-                <w:rFonts w:ascii="Calibri" w:cs="Calibri" w:eastAsia="Calibri" w:hAnsi="Calibri"/>
-                <w:b w:val="false"/>
-                <w:bCs w:val="false"/>
-                <w:sz w:val="18"/>
-                <w:szCs w:val="18"/>
-              </w:rPr>
-              <w:t xml:space="preserve">CU-COM-01</w:t>
-            </w:r>
-          </w:p>
-        </w:tc>
-        <w:tc>
-          <w:tcPr>
-            <w:tcW w:type="dxa" w:w="6760"/>
-            <w:tcBorders>
-              <w:top w:val="single" w:color="8496B0" w:sz="4"/>
-              <w:left w:val="single" w:color="8496B0" w:sz="4"/>
-              <w:bottom w:val="single" w:color="8496B0" w:sz="4"/>
-              <w:right w:val="single" w:color="8496B0" w:sz="4"/>
-            </w:tcBorders>
-            <w:tcMar>
-              <w:top w:type="dxa" w:w="50"/>
-              <w:left w:type="dxa" w:w="90"/>
-              <w:bottom w:type="dxa" w:w="50"/>
-              <w:right w:type="dxa" w:w="90"/>
-            </w:tcMar>
-          </w:tcPr>
-          <w:p>
-            <w:r>
-              <w:rPr>
-                <w:rFonts w:ascii="Calibri" w:cs="Calibri" w:eastAsia="Calibri" w:hAnsi="Calibri"/>
-                <w:b w:val="false"/>
-                <w:bCs w:val="false"/>
-                <w:sz w:val="18"/>
-                <w:szCs w:val="18"/>
-              </w:rPr>
-              <w:t xml:space="preserve">Los valores técnicos no se validan contra un rango mínimo y máximo (hallazgo H-01 del EVI-01), y las unidades de una solicitud no tienen tope (H-02).</w:t>
-            </w:r>
-          </w:p>
-        </w:tc>
-      </w:tr>
-      <w:tr>
-        <w:trPr>
-          <w:cantSplit/>
-        </w:trPr>
-        <w:tc>
-          <w:tcPr>
-            <w:tcW w:type="dxa" w:w="2600"/>
-            <w:tcBorders>
-              <w:top w:val="single" w:color="8496B0" w:sz="4"/>
-              <w:left w:val="single" w:color="8496B0" w:sz="4"/>
-              <w:bottom w:val="single" w:color="8496B0" w:sz="4"/>
-              <w:right w:val="single" w:color="8496B0" w:sz="4"/>
-            </w:tcBorders>
-            <w:tcMar>
-              <w:top w:type="dxa" w:w="50"/>
-              <w:left w:type="dxa" w:w="90"/>
-              <w:bottom w:type="dxa" w:w="50"/>
-              <w:right w:type="dxa" w:w="90"/>
-            </w:tcMar>
-          </w:tcPr>
-          <w:p>
-            <w:r>
-              <w:rPr>
-                <w:rFonts w:ascii="Calibri" w:cs="Calibri" w:eastAsia="Calibri" w:hAnsi="Calibri"/>
-                <w:b w:val="false"/>
-                <w:bCs w:val="false"/>
-                <w:sz w:val="18"/>
-                <w:szCs w:val="18"/>
-              </w:rPr>
-              <w:t xml:space="preserve">CU-COM-03</w:t>
-            </w:r>
-          </w:p>
-        </w:tc>
-        <w:tc>
-          <w:tcPr>
-            <w:tcW w:type="dxa" w:w="6760"/>
-            <w:tcBorders>
-              <w:top w:val="single" w:color="8496B0" w:sz="4"/>
-              <w:left w:val="single" w:color="8496B0" w:sz="4"/>
-              <w:bottom w:val="single" w:color="8496B0" w:sz="4"/>
-              <w:right w:val="single" w:color="8496B0" w:sz="4"/>
-            </w:tcBorders>
-            <w:tcMar>
-              <w:top w:type="dxa" w:w="50"/>
-              <w:left w:type="dxa" w:w="90"/>
-              <w:bottom w:type="dxa" w:w="50"/>
-              <w:right w:type="dxa" w:w="90"/>
-            </w:tcMar>
-          </w:tcPr>
-          <w:p>
-            <w:r>
-              <w:rPr>
-                <w:rFonts w:ascii="Calibri" w:cs="Calibri" w:eastAsia="Calibri" w:hAnsi="Calibri"/>
-                <w:b w:val="false"/>
-                <w:bCs w:val="false"/>
-                <w:sz w:val="18"/>
-                <w:szCs w:val="18"/>
-              </w:rPr>
-              <w:t xml:space="preserve">Cuando faltan los feriados, el plazo se calcula sin advertir al ejecutivo.</w:t>
-            </w:r>
-          </w:p>
-        </w:tc>
-      </w:tr>
-      <w:tr>
-        <w:trPr>
-          <w:cantSplit/>
-        </w:trPr>
-        <w:tc>
-          <w:tcPr>
-            <w:tcW w:type="dxa" w:w="2600"/>
-            <w:tcBorders>
-              <w:top w:val="single" w:color="8496B0" w:sz="4"/>
-              <w:left w:val="single" w:color="8496B0" w:sz="4"/>
-              <w:bottom w:val="single" w:color="8496B0" w:sz="4"/>
-              <w:right w:val="single" w:color="8496B0" w:sz="4"/>
-            </w:tcBorders>
-            <w:tcMar>
-              <w:top w:type="dxa" w:w="50"/>
-              <w:left w:type="dxa" w:w="90"/>
-              <w:bottom w:type="dxa" w:w="50"/>
-              <w:right w:type="dxa" w:w="90"/>
-            </w:tcMar>
-          </w:tcPr>
-          <w:p>
-            <w:r>
-              <w:rPr>
-                <w:rFonts w:ascii="Calibri" w:cs="Calibri" w:eastAsia="Calibri" w:hAnsi="Calibri"/>
-                <w:b w:val="false"/>
-                <w:bCs w:val="false"/>
-                <w:sz w:val="18"/>
-                <w:szCs w:val="18"/>
-              </w:rPr>
-              <w:t xml:space="preserve">CU-INV-03</w:t>
-            </w:r>
-          </w:p>
-        </w:tc>
-        <w:tc>
-          <w:tcPr>
-            <w:tcW w:type="dxa" w:w="6760"/>
-            <w:tcBorders>
-              <w:top w:val="single" w:color="8496B0" w:sz="4"/>
-              <w:left w:val="single" w:color="8496B0" w:sz="4"/>
-              <w:bottom w:val="single" w:color="8496B0" w:sz="4"/>
-              <w:right w:val="single" w:color="8496B0" w:sz="4"/>
-            </w:tcBorders>
-            <w:tcMar>
-              <w:top w:type="dxa" w:w="50"/>
-              <w:left w:type="dxa" w:w="90"/>
-              <w:bottom w:type="dxa" w:w="50"/>
-              <w:right w:type="dxa" w:w="90"/>
-            </w:tcMar>
-          </w:tcPr>
-          <w:p>
-            <w:r>
-              <w:rPr>
-                <w:rFonts w:ascii="Calibri" w:cs="Calibri" w:eastAsia="Calibri" w:hAnsi="Calibri"/>
-                <w:b w:val="false"/>
-                <w:bCs w:val="false"/>
-                <w:sz w:val="18"/>
-                <w:szCs w:val="18"/>
-              </w:rPr>
-              <w:t xml:space="preserve">Las bodegas no se editan ni desactivan en pantalla.</w:t>
-            </w:r>
-          </w:p>
-        </w:tc>
-      </w:tr>
-      <w:tr>
-        <w:trPr>
-          <w:cantSplit/>
-        </w:trPr>
-        <w:tc>
-          <w:tcPr>
-            <w:tcW w:type="dxa" w:w="2600"/>
-            <w:tcBorders>
-              <w:top w:val="single" w:color="8496B0" w:sz="4"/>
-              <w:left w:val="single" w:color="8496B0" w:sz="4"/>
-              <w:bottom w:val="single" w:color="8496B0" w:sz="4"/>
-              <w:right w:val="single" w:color="8496B0" w:sz="4"/>
-            </w:tcBorders>
-            <w:tcMar>
-              <w:top w:type="dxa" w:w="50"/>
-              <w:left w:type="dxa" w:w="90"/>
-              <w:bottom w:type="dxa" w:w="50"/>
-              <w:right w:type="dxa" w:w="90"/>
-            </w:tcMar>
-          </w:tcPr>
-          <w:p>
-            <w:r>
-              <w:rPr>
-                <w:rFonts w:ascii="Calibri" w:cs="Calibri" w:eastAsia="Calibri" w:hAnsi="Calibri"/>
-                <w:b w:val="false"/>
-                <w:bCs w:val="false"/>
-                <w:sz w:val="18"/>
-                <w:szCs w:val="18"/>
-              </w:rPr>
-              <w:t xml:space="preserve">CU-OT-05</w:t>
-            </w:r>
-          </w:p>
-        </w:tc>
-        <w:tc>
-          <w:tcPr>
-            <w:tcW w:type="dxa" w:w="6760"/>
-            <w:tcBorders>
-              <w:top w:val="single" w:color="8496B0" w:sz="4"/>
-              <w:left w:val="single" w:color="8496B0" w:sz="4"/>
-              <w:bottom w:val="single" w:color="8496B0" w:sz="4"/>
-              <w:right w:val="single" w:color="8496B0" w:sz="4"/>
-            </w:tcBorders>
-            <w:tcMar>
-              <w:top w:type="dxa" w:w="50"/>
-              <w:left w:type="dxa" w:w="90"/>
-              <w:bottom w:type="dxa" w:w="50"/>
-              <w:right w:type="dxa" w:w="90"/>
-            </w:tcMar>
-          </w:tcPr>
-          <w:p>
-            <w:r>
-              <w:rPr>
-                <w:rFonts w:ascii="Calibri" w:cs="Calibri" w:eastAsia="Calibri" w:hAnsi="Calibri"/>
-                <w:b w:val="false"/>
-                <w:bCs w:val="false"/>
-                <w:sz w:val="18"/>
-                <w:szCs w:val="18"/>
-              </w:rPr>
-              <w:t xml:space="preserve">La anulación de horas no tiene botón en el escritorio, y las horas se registran sólo con la fecha del día.</w:t>
-            </w:r>
-          </w:p>
-        </w:tc>
-      </w:tr>
-      <w:tr>
-        <w:trPr>
-          <w:cantSplit/>
-        </w:trPr>
-        <w:tc>
-          <w:tcPr>
-            <w:tcW w:type="dxa" w:w="2600"/>
-            <w:tcBorders>
-              <w:top w:val="single" w:color="8496B0" w:sz="4"/>
-              <w:left w:val="single" w:color="8496B0" w:sz="4"/>
-              <w:bottom w:val="single" w:color="8496B0" w:sz="4"/>
-              <w:right w:val="single" w:color="8496B0" w:sz="4"/>
-            </w:tcBorders>
-            <w:tcMar>
-              <w:top w:type="dxa" w:w="50"/>
-              <w:left w:type="dxa" w:w="90"/>
-              <w:bottom w:type="dxa" w:w="50"/>
-              <w:right w:type="dxa" w:w="90"/>
-            </w:tcMar>
-          </w:tcPr>
-          <w:p>
-            <w:r>
-              <w:rPr>
-                <w:rFonts w:ascii="Calibri" w:cs="Calibri" w:eastAsia="Calibri" w:hAnsi="Calibri"/>
-                <w:b w:val="false"/>
-                <w:bCs w:val="false"/>
-                <w:sz w:val="18"/>
-                <w:szCs w:val="18"/>
-              </w:rPr>
-              <w:t xml:space="preserve">CU-ADM-05, CU-ADM-07</w:t>
-            </w:r>
-          </w:p>
-        </w:tc>
-        <w:tc>
-          <w:tcPr>
-            <w:tcW w:type="dxa" w:w="6760"/>
-            <w:tcBorders>
-              <w:top w:val="single" w:color="8496B0" w:sz="4"/>
-              <w:left w:val="single" w:color="8496B0" w:sz="4"/>
-              <w:bottom w:val="single" w:color="8496B0" w:sz="4"/>
-              <w:right w:val="single" w:color="8496B0" w:sz="4"/>
-            </w:tcBorders>
-            <w:tcMar>
-              <w:top w:type="dxa" w:w="50"/>
-              <w:left w:type="dxa" w:w="90"/>
-              <w:bottom w:type="dxa" w:w="50"/>
-              <w:right w:type="dxa" w:w="90"/>
-            </w:tcMar>
-          </w:tcPr>
-          <w:p>
-            <w:r>
-              <w:rPr>
-                <w:rFonts w:ascii="Calibri" w:cs="Calibri" w:eastAsia="Calibri" w:hAnsi="Calibri"/>
-                <w:b w:val="false"/>
-                <w:bCs w:val="false"/>
-                <w:sz w:val="18"/>
-                <w:szCs w:val="18"/>
-              </w:rPr>
-              <w:t xml:space="preserve">Los avisos del sitio no quedan en la bitácora.</w:t>
-            </w:r>
-          </w:p>
-        </w:tc>
-      </w:tr>
-      <w:tr>
-        <w:trPr>
-          <w:cantSplit/>
-        </w:trPr>
-        <w:tc>
-          <w:tcPr>
-            <w:tcW w:type="dxa" w:w="2600"/>
-            <w:tcBorders>
-              <w:top w:val="single" w:color="8496B0" w:sz="4"/>
-              <w:left w:val="single" w:color="8496B0" w:sz="4"/>
-              <w:bottom w:val="single" w:color="8496B0" w:sz="4"/>
-              <w:right w:val="single" w:color="8496B0" w:sz="4"/>
-            </w:tcBorders>
-            <w:tcMar>
-              <w:top w:type="dxa" w:w="50"/>
-              <w:left w:type="dxa" w:w="90"/>
-              <w:bottom w:type="dxa" w:w="50"/>
-              <w:right w:type="dxa" w:w="90"/>
-            </w:tcMar>
-          </w:tcPr>
-          <w:p>
-            <w:r>
-              <w:rPr>
-                <w:rFonts w:ascii="Calibri" w:cs="Calibri" w:eastAsia="Calibri" w:hAnsi="Calibri"/>
-                <w:b w:val="false"/>
-                <w:bCs w:val="false"/>
-                <w:sz w:val="18"/>
-                <w:szCs w:val="18"/>
-              </w:rPr>
-              <w:t xml:space="preserve">CU-PAG-03, CU-PAG-04</w:t>
-            </w:r>
-          </w:p>
-        </w:tc>
-        <w:tc>
-          <w:tcPr>
-            <w:tcW w:type="dxa" w:w="6760"/>
-            <w:tcBorders>
-              <w:top w:val="single" w:color="8496B0" w:sz="4"/>
-              <w:left w:val="single" w:color="8496B0" w:sz="4"/>
-              <w:bottom w:val="single" w:color="8496B0" w:sz="4"/>
-              <w:right w:val="single" w:color="8496B0" w:sz="4"/>
-            </w:tcBorders>
-            <w:tcMar>
-              <w:top w:type="dxa" w:w="50"/>
-              <w:left w:type="dxa" w:w="90"/>
-              <w:bottom w:type="dxa" w:w="50"/>
-              <w:right w:type="dxa" w:w="90"/>
-            </w:tcMar>
-          </w:tcPr>
-          <w:p>
-            <w:r>
-              <w:rPr>
-                <w:rFonts w:ascii="Calibri" w:cs="Calibri" w:eastAsia="Calibri" w:hAnsi="Calibri"/>
-                <w:b w:val="false"/>
-                <w:bCs w:val="false"/>
-                <w:sz w:val="18"/>
-                <w:szCs w:val="18"/>
-              </w:rPr>
-              <w:t xml:space="preserve">La conciliación diferida se ejecuta a mano (no está en la tarea diaria) y no envía el correo de confirmación.</w:t>
-            </w:r>
-          </w:p>
-        </w:tc>
-      </w:tr>
-      <w:tr>
-        <w:trPr>
-          <w:cantSplit/>
-        </w:trPr>
-        <w:tc>
-          <w:tcPr>
-            <w:tcW w:type="dxa" w:w="2600"/>
-            <w:tcBorders>
-              <w:top w:val="single" w:color="8496B0" w:sz="4"/>
-              <w:left w:val="single" w:color="8496B0" w:sz="4"/>
-              <w:bottom w:val="single" w:color="8496B0" w:sz="4"/>
-              <w:right w:val="single" w:color="8496B0" w:sz="4"/>
-            </w:tcBorders>
-            <w:tcMar>
-              <w:top w:type="dxa" w:w="50"/>
-              <w:left w:type="dxa" w:w="90"/>
-              <w:bottom w:type="dxa" w:w="50"/>
-              <w:right w:type="dxa" w:w="90"/>
-            </w:tcMar>
-          </w:tcPr>
-          <w:p>
-            <w:r>
-              <w:rPr>
-                <w:rFonts w:ascii="Calibri" w:cs="Calibri" w:eastAsia="Calibri" w:hAnsi="Calibri"/>
-                <w:b w:val="false"/>
-                <w:bCs w:val="false"/>
-                <w:sz w:val="18"/>
-                <w:szCs w:val="18"/>
-              </w:rPr>
-              <w:t xml:space="preserve">Configuración</w:t>
-            </w:r>
-          </w:p>
-        </w:tc>
-        <w:tc>
-          <w:tcPr>
-            <w:tcW w:type="dxa" w:w="6760"/>
-            <w:tcBorders>
-              <w:top w:val="single" w:color="8496B0" w:sz="4"/>
-              <w:left w:val="single" w:color="8496B0" w:sz="4"/>
-              <w:bottom w:val="single" w:color="8496B0" w:sz="4"/>
-              <w:right w:val="single" w:color="8496B0" w:sz="4"/>
-            </w:tcBorders>
-            <w:tcMar>
-              <w:top w:type="dxa" w:w="50"/>
-              <w:left w:type="dxa" w:w="90"/>
-              <w:bottom w:type="dxa" w:w="50"/>
-              <w:right w:type="dxa" w:w="90"/>
-            </w:tcMar>
-          </w:tcPr>
-          <w:p>
-            <w:r>
-              <w:rPr>
-                <w:rFonts w:ascii="Calibri" w:cs="Calibri" w:eastAsia="Calibri" w:hAnsi="Calibri"/>
-                <w:b w:val="false"/>
-                <w:bCs w:val="false"/>
-                <w:sz w:val="18"/>
-                <w:szCs w:val="18"/>
-              </w:rPr>
-              <w:t xml:space="preserve">El umbral de descuento, el porcentaje de anticipo y el umbral de desviación se leen de la configuración del servidor y no de los parámetros editables; además, esos parámetros no se pueden editar desde el panel Canal web.</w:t>
+              <w:t xml:space="preserve">No hay categorías de producto: los modelos se agrupan sólo por familia. Se decidió no agregarlas porque el catálogo actual no las necesita.</w:t>
             </w:r>
           </w:p>
         </w:tc>
@@ -46763,6 +46272,127 @@
                 <w:szCs w:val="20"/>
               </w:rPr>
               <w:t xml:space="preserve">Aprobación explícita del control de calidad y estado «Liberada por calidad» (CU-CAL-07, CU-OT-08), bandeja de pendientes por rol (CU-REP-04) y avisos por correo entre roles (CU-REP-05).</w:t>
+            </w:r>
+          </w:p>
+        </w:tc>
+      </w:tr>
+      <w:tr>
+        <w:trPr>
+          <w:cantSplit/>
+        </w:trPr>
+        <w:tc>
+          <w:tcPr>
+            <w:tcW w:type="dxa" w:w="1000"/>
+            <w:tcBorders>
+              <w:top w:val="single" w:color="8496B0" w:sz="4"/>
+              <w:left w:val="single" w:color="8496B0" w:sz="4"/>
+              <w:bottom w:val="single" w:color="8496B0" w:sz="4"/>
+              <w:right w:val="single" w:color="8496B0" w:sz="4"/>
+            </w:tcBorders>
+            <w:tcMar>
+              <w:top w:type="dxa" w:w="50"/>
+              <w:left w:type="dxa" w:w="90"/>
+              <w:bottom w:type="dxa" w:w="50"/>
+              <w:right w:type="dxa" w:w="90"/>
+            </w:tcMar>
+          </w:tcPr>
+          <w:p>
+            <w:r>
+              <w:rPr>
+                <w:rFonts w:ascii="Calibri" w:cs="Calibri" w:eastAsia="Calibri" w:hAnsi="Calibri"/>
+                <w:b w:val="false"/>
+                <w:bCs w:val="false"/>
+                <w:sz w:val="20"/>
+                <w:szCs w:val="20"/>
+              </w:rPr>
+              <w:t xml:space="preserve">2.2</w:t>
+            </w:r>
+          </w:p>
+        </w:tc>
+        <w:tc>
+          <w:tcPr>
+            <w:tcW w:type="dxa" w:w="1700"/>
+            <w:tcBorders>
+              <w:top w:val="single" w:color="8496B0" w:sz="4"/>
+              <w:left w:val="single" w:color="8496B0" w:sz="4"/>
+              <w:bottom w:val="single" w:color="8496B0" w:sz="4"/>
+              <w:right w:val="single" w:color="8496B0" w:sz="4"/>
+            </w:tcBorders>
+            <w:tcMar>
+              <w:top w:type="dxa" w:w="50"/>
+              <w:left w:type="dxa" w:w="90"/>
+              <w:bottom w:type="dxa" w:w="50"/>
+              <w:right w:type="dxa" w:w="90"/>
+            </w:tcMar>
+          </w:tcPr>
+          <w:p>
+            <w:r>
+              <w:rPr>
+                <w:rFonts w:ascii="Calibri" w:cs="Calibri" w:eastAsia="Calibri" w:hAnsi="Calibri"/>
+                <w:b w:val="false"/>
+                <w:bCs w:val="false"/>
+                <w:sz w:val="20"/>
+                <w:szCs w:val="20"/>
+              </w:rPr>
+              <w:t xml:space="preserve">10-10-2026</w:t>
+            </w:r>
+          </w:p>
+        </w:tc>
+        <w:tc>
+          <w:tcPr>
+            <w:tcW w:type="dxa" w:w="2300"/>
+            <w:tcBorders>
+              <w:top w:val="single" w:color="8496B0" w:sz="4"/>
+              <w:left w:val="single" w:color="8496B0" w:sz="4"/>
+              <w:bottom w:val="single" w:color="8496B0" w:sz="4"/>
+              <w:right w:val="single" w:color="8496B0" w:sz="4"/>
+            </w:tcBorders>
+            <w:tcMar>
+              <w:top w:type="dxa" w:w="50"/>
+              <w:left w:type="dxa" w:w="90"/>
+              <w:bottom w:type="dxa" w:w="50"/>
+              <w:right w:type="dxa" w:w="90"/>
+            </w:tcMar>
+          </w:tcPr>
+          <w:p>
+            <w:r>
+              <w:rPr>
+                <w:rFonts w:ascii="Calibri" w:cs="Calibri" w:eastAsia="Calibri" w:hAnsi="Calibri"/>
+                <w:b w:val="false"/>
+                <w:bCs w:val="false"/>
+                <w:sz w:val="20"/>
+                <w:szCs w:val="20"/>
+              </w:rPr>
+              <w:t xml:space="preserve">Benjamín Delgado Bravo</w:t>
+            </w:r>
+          </w:p>
+        </w:tc>
+        <w:tc>
+          <w:tcPr>
+            <w:tcW w:type="dxa" w:w="4360"/>
+            <w:tcBorders>
+              <w:top w:val="single" w:color="8496B0" w:sz="4"/>
+              <w:left w:val="single" w:color="8496B0" w:sz="4"/>
+              <w:bottom w:val="single" w:color="8496B0" w:sz="4"/>
+              <w:right w:val="single" w:color="8496B0" w:sz="4"/>
+            </w:tcBorders>
+            <w:tcMar>
+              <w:top w:type="dxa" w:w="50"/>
+              <w:left w:type="dxa" w:w="90"/>
+              <w:bottom w:type="dxa" w:w="50"/>
+              <w:right w:type="dxa" w:w="90"/>
+            </w:tcMar>
+          </w:tcPr>
+          <w:p>
+            <w:r>
+              <w:rPr>
+                <w:rFonts w:ascii="Calibri" w:cs="Calibri" w:eastAsia="Calibri" w:hAnsi="Calibri"/>
+                <w:b w:val="false"/>
+                <w:bCs w:val="false"/>
+                <w:sz w:val="20"/>
+                <w:szCs w:val="20"/>
+              </w:rPr>
+              <w:t xml:space="preserve">Los siete casos parciales pasan a implementados (CU-CLI-02, CU-CLI-07, CU-CAT-01, CU-CAT-03, CU-INV-03, CU-ADM-04, CU-ADM-07); validación de rangos y tope de unidades en CU-COM-01; advertencia de plazo en CU-COM-03; anulación y fecha de horas; conciliación diaria; sección 7 actualizada.</w:t>
             </w:r>
           </w:p>
         </w:tc>
@@ -46904,7 +46534,7 @@
         <w:sz w:val="16"/>
         <w:szCs w:val="16"/>
       </w:rPr>
-      <w:t xml:space="preserve">SITRAFO · CU-01 Modelo de Casos de Uso · v2.1</w:t>
+      <w:t xml:space="preserve">SITRAFO · CU-01 Modelo de Casos de Uso · v2.2</w:t>
     </w:r>
   </w:p>
 </w:hdr>

</xml_diff>